<commit_message>
Add multi-ticker Double Heston robustness check and viva prep cheat sheet
Confirms the factor-2-negligible finding holds across 5 tickers (AAPL,
SPY, TSLA, MSFT, JPM), not just one. Cheat sheet condenses every formula,
calibrated number, and judgment call for oral exam prep.

Co-Authored-By: Claude Sonnet 5 <noreply@anthropic.com>
</commit_message>
<xml_diff>
--- a/report/Stock_Price_Modeling_Report.docx
+++ b/report/Stock_Price_Modeling_Report.docx
@@ -1154,7 +1154,312 @@
           <w:b w:val="0"/>
           <w:i w:val="0"/>
         </w:rPr>
-        <w:t>Double Heston, warm-started from the 5-year single-Heston fit above, was calibrated on the same data. Factor 2's share of total long-run variance came out at 2.56e-13 -- essentially exactly zero. Figure 3 shows why: the single- and double-Heston autocorrelation fits are visually indistinguishable, both tracking the empirical decay reasonably (though imperfectly) with a single effective timescale. The calibration was checked on multiple tickers during development (AAPL, SPY, TSLA) and consistently found the same result: no genuine second timescale emerges in realized-variance persistence at this window/frequency. As discussed in Section 3.2, Double Heston's classic empirical motivation comes from fitting short- and long-dated OPTION-implied-volatility smiles simultaneously -- a genuinely different target than the autocorrelation of realized variance from spot returns, and this result should be read as evidence about that difference, not as a failure of the Double Heston model or its implementation (which is independently validated in Section 5.3's style of test -- see tests/test_double_heston.py for the formal version: Double Heston with factor 2 switched off recovers single Heston prices to within 0.01%).</w:t>
+        <w:t>Double Heston, warm-started from the 5-year single-Heston fit above, was calibrated on the same data. Factor 2's share of total long-run variance came out at 2.56e-13 -- essentially exactly zero. Figure 3 shows why: the single- and double-Heston autocorrelation fits are visually indistinguishable, both tracking the empirical decay reasonably (though imperfectly) with a single effective timescale.</w:t>
+      </w:r>
+    </w:p>
+    <w:p>
+      <w:r>
+        <w:rPr>
+          <w:b w:val="0"/>
+          <w:i w:val="0"/>
+        </w:rPr>
+        <w:t>To check this was not a one-ticker fluke, the same calibration (10-year window) was run on 5 tickers spanning different sectors and market-cap profiles: a broad index ETF (SPY), three mega-cap equities across different sectors (AAPL, MSFT, JPM), and a high-volatility growth stock (TSLA). The result was consistent across all five -- factor 2's share of total variance never exceeded 1%, and every ticker recovered the theoretically expected NEGATIVE leverage correlation:</w:t>
+      </w:r>
+    </w:p>
+    <w:tbl>
+      <w:tblPr>
+        <w:tblStyle w:val="LightGrid-Accent1"/>
+        <w:tblW w:type="auto" w:w="0"/>
+        <w:jc w:val="center"/>
+        <w:tblLook w:firstColumn="1" w:firstRow="1" w:lastColumn="0" w:lastRow="0" w:noHBand="0" w:noVBand="1" w:val="04A0"/>
+      </w:tblPr>
+      <w:tblGrid>
+        <w:gridCol w:w="2160"/>
+        <w:gridCol w:w="2160"/>
+        <w:gridCol w:w="2160"/>
+        <w:gridCol w:w="2160"/>
+      </w:tblGrid>
+      <w:tr>
+        <w:tc>
+          <w:tcPr>
+            <w:tcW w:type="dxa" w:w="2160"/>
+          </w:tcPr>
+          <w:p>
+            <w:r>
+              <w:rPr>
+                <w:b/>
+              </w:rPr>
+              <w:t>Ticker</w:t>
+            </w:r>
+          </w:p>
+        </w:tc>
+        <w:tc>
+          <w:tcPr>
+            <w:tcW w:type="dxa" w:w="2160"/>
+          </w:tcPr>
+          <w:p>
+            <w:r>
+              <w:rPr>
+                <w:b/>
+              </w:rPr>
+              <w:t>Long-run vol (single Heston)</w:t>
+            </w:r>
+          </w:p>
+        </w:tc>
+        <w:tc>
+          <w:tcPr>
+            <w:tcW w:type="dxa" w:w="2160"/>
+          </w:tcPr>
+          <w:p>
+            <w:r>
+              <w:rPr>
+                <w:b/>
+              </w:rPr>
+              <w:t>rho</w:t>
+            </w:r>
+          </w:p>
+        </w:tc>
+        <w:tc>
+          <w:tcPr>
+            <w:tcW w:type="dxa" w:w="2160"/>
+          </w:tcPr>
+          <w:p>
+            <w:r>
+              <w:rPr>
+                <w:b/>
+              </w:rPr>
+              <w:t>Factor 2 variance share (Double Heston)</w:t>
+            </w:r>
+          </w:p>
+        </w:tc>
+      </w:tr>
+      <w:tr>
+        <w:tc>
+          <w:tcPr>
+            <w:tcW w:type="dxa" w:w="2160"/>
+          </w:tcPr>
+          <w:p>
+            <w:r>
+              <w:t>AAPL</w:t>
+            </w:r>
+          </w:p>
+        </w:tc>
+        <w:tc>
+          <w:tcPr>
+            <w:tcW w:type="dxa" w:w="2160"/>
+          </w:tcPr>
+          <w:p>
+            <w:r>
+              <w:t>32.3%</w:t>
+            </w:r>
+          </w:p>
+        </w:tc>
+        <w:tc>
+          <w:tcPr>
+            <w:tcW w:type="dxa" w:w="2160"/>
+          </w:tcPr>
+          <w:p>
+            <w:r>
+              <w:t>-0.429</w:t>
+            </w:r>
+          </w:p>
+        </w:tc>
+        <w:tc>
+          <w:tcPr>
+            <w:tcW w:type="dxa" w:w="2160"/>
+          </w:tcPr>
+          <w:p>
+            <w:r>
+              <w:t>2.12e-04</w:t>
+            </w:r>
+          </w:p>
+        </w:tc>
+      </w:tr>
+      <w:tr>
+        <w:tc>
+          <w:tcPr>
+            <w:tcW w:type="dxa" w:w="2160"/>
+          </w:tcPr>
+          <w:p>
+            <w:r>
+              <w:t>SPY</w:t>
+            </w:r>
+          </w:p>
+        </w:tc>
+        <w:tc>
+          <w:tcPr>
+            <w:tcW w:type="dxa" w:w="2160"/>
+          </w:tcPr>
+          <w:p>
+            <w:r>
+              <w:t>20.9%</w:t>
+            </w:r>
+          </w:p>
+        </w:tc>
+        <w:tc>
+          <w:tcPr>
+            <w:tcW w:type="dxa" w:w="2160"/>
+          </w:tcPr>
+          <w:p>
+            <w:r>
+              <w:t>-0.665</w:t>
+            </w:r>
+          </w:p>
+        </w:tc>
+        <w:tc>
+          <w:tcPr>
+            <w:tcW w:type="dxa" w:w="2160"/>
+          </w:tcPr>
+          <w:p>
+            <w:r>
+              <w:t>3.66e-04</w:t>
+            </w:r>
+          </w:p>
+        </w:tc>
+      </w:tr>
+      <w:tr>
+        <w:tc>
+          <w:tcPr>
+            <w:tcW w:type="dxa" w:w="2160"/>
+          </w:tcPr>
+          <w:p>
+            <w:r>
+              <w:t>TSLA</w:t>
+            </w:r>
+          </w:p>
+        </w:tc>
+        <w:tc>
+          <w:tcPr>
+            <w:tcW w:type="dxa" w:w="2160"/>
+          </w:tcPr>
+          <w:p>
+            <w:r>
+              <w:t>59.4%</w:t>
+            </w:r>
+          </w:p>
+        </w:tc>
+        <w:tc>
+          <w:tcPr>
+            <w:tcW w:type="dxa" w:w="2160"/>
+          </w:tcPr>
+          <w:p>
+            <w:r>
+              <w:t>-0.305</w:t>
+            </w:r>
+          </w:p>
+        </w:tc>
+        <w:tc>
+          <w:tcPr>
+            <w:tcW w:type="dxa" w:w="2160"/>
+          </w:tcPr>
+          <w:p>
+            <w:r>
+              <w:t>7.11e-03</w:t>
+            </w:r>
+          </w:p>
+        </w:tc>
+      </w:tr>
+      <w:tr>
+        <w:tc>
+          <w:tcPr>
+            <w:tcW w:type="dxa" w:w="2160"/>
+          </w:tcPr>
+          <w:p>
+            <w:r>
+              <w:t>MSFT</w:t>
+            </w:r>
+          </w:p>
+        </w:tc>
+        <w:tc>
+          <w:tcPr>
+            <w:tcW w:type="dxa" w:w="2160"/>
+          </w:tcPr>
+          <w:p>
+            <w:r>
+              <w:t>31.8%</w:t>
+            </w:r>
+          </w:p>
+        </w:tc>
+        <w:tc>
+          <w:tcPr>
+            <w:tcW w:type="dxa" w:w="2160"/>
+          </w:tcPr>
+          <w:p>
+            <w:r>
+              <w:t>-0.408</w:t>
+            </w:r>
+          </w:p>
+        </w:tc>
+        <w:tc>
+          <w:tcPr>
+            <w:tcW w:type="dxa" w:w="2160"/>
+          </w:tcPr>
+          <w:p>
+            <w:r>
+              <w:t>2.46e-04</w:t>
+            </w:r>
+          </w:p>
+        </w:tc>
+      </w:tr>
+      <w:tr>
+        <w:tc>
+          <w:tcPr>
+            <w:tcW w:type="dxa" w:w="2160"/>
+          </w:tcPr>
+          <w:p>
+            <w:r>
+              <w:t>JPM</w:t>
+            </w:r>
+          </w:p>
+        </w:tc>
+        <w:tc>
+          <w:tcPr>
+            <w:tcW w:type="dxa" w:w="2160"/>
+          </w:tcPr>
+          <w:p>
+            <w:r>
+              <w:t>32.0%</w:t>
+            </w:r>
+          </w:p>
+        </w:tc>
+        <w:tc>
+          <w:tcPr>
+            <w:tcW w:type="dxa" w:w="2160"/>
+          </w:tcPr>
+          <w:p>
+            <w:r>
+              <w:t>-0.464</w:t>
+            </w:r>
+          </w:p>
+        </w:tc>
+        <w:tc>
+          <w:tcPr>
+            <w:tcW w:type="dxa" w:w="2160"/>
+          </w:tcPr>
+          <w:p>
+            <w:r>
+              <w:t>3.86e-04</w:t>
+            </w:r>
+          </w:p>
+        </w:tc>
+      </w:tr>
+    </w:tbl>
+    <w:p>
+      <w:r>
+        <w:rPr>
+          <w:b w:val="0"/>
+          <w:i/>
+        </w:rPr>
+        <w:t>Table: Double Heston multi-ticker robustness check (10-year calibration window, each ticker independent). Factor 2's share stays below 1% in every case, with TSLA (the highest-vol, most growth/momentum-driven name tested) showing the largest -- but still negligible -- second-factor contribution.</w:t>
+      </w:r>
+    </w:p>
+    <w:p>
+      <w:r>
+        <w:rPr>
+          <w:b w:val="0"/>
+          <w:i w:val="0"/>
+        </w:rPr>
+        <w:t>As discussed in Section 3.2, Double Heston's classic empirical motivation comes from fitting short- and long-dated OPTION-implied-volatility smiles simultaneously -- a genuinely different target than the autocorrelation of realized variance from spot returns, and this result should be read as evidence about that difference, not as a failure of the Double Heston model or its implementation (which is independently validated in Section 5.3's style of test -- see tests/test_double_heston.py for the formal version: Double Heston with factor 2 switched off recovers single Heston prices to within 0.01%).</w:t>
       </w:r>
     </w:p>
     <w:p>

</xml_diff>